<commit_message>
fix(yuhuan): meal lines match Zhoushan **午餐：** format
</commit_message>
<xml_diff>
--- a/trip/yuhuan/yuhuan.docx
+++ b/trip/yuhuan/yuhuan.docx
@@ -167,7 +167,7 @@
     </w:p>
     <w:p>
       <w:pPr>
-        <w:spacing w:after="120" w:lineRule="auto" w:line="300"/>
+        <w:spacing w:after="60" w:lineRule="auto" w:line="300"/>
       </w:pPr>
       <w:r>
         <w:rPr>
@@ -175,12 +175,12 @@
           <w:b w:val="0"/>
           <w:sz w:val="21"/>
         </w:rPr>
-        <w:t>**午餐：后沙·坎门一带</w:t>
+        <w:t>午餐: 后沙·坎门一带</w:t>
       </w:r>
     </w:p>
     <w:p>
       <w:pPr>
-        <w:spacing w:after="120" w:lineRule="auto" w:line="300"/>
+        <w:spacing w:after="60" w:lineRule="auto" w:line="300"/>
       </w:pPr>
       <w:r>
         <w:rPr>
@@ -188,7 +188,7 @@
           <w:b w:val="0"/>
           <w:sz w:val="21"/>
         </w:rPr>
-        <w:t>晚餐：后沙海景或酒店圈**</w:t>
+        <w:t>晚餐: 后沙海景或酒店圈</w:t>
       </w:r>
     </w:p>
     <w:p>
@@ -220,7 +220,7 @@
     </w:p>
     <w:p>
       <w:pPr>
-        <w:spacing w:after="120" w:lineRule="auto" w:line="300"/>
+        <w:spacing w:after="60" w:lineRule="auto" w:line="300"/>
       </w:pPr>
       <w:r>
         <w:rPr>
@@ -228,12 +228,12 @@
           <w:b w:val="0"/>
           <w:sz w:val="21"/>
         </w:rPr>
-        <w:t>**午餐：后沙·坎门一带</w:t>
+        <w:t>午餐: 后沙·坎门一带</w:t>
       </w:r>
     </w:p>
     <w:p>
       <w:pPr>
-        <w:spacing w:after="120" w:lineRule="auto" w:line="300"/>
+        <w:spacing w:after="60" w:lineRule="auto" w:line="300"/>
       </w:pPr>
       <w:r>
         <w:rPr>
@@ -241,7 +241,7 @@
           <w:b w:val="0"/>
           <w:sz w:val="21"/>
         </w:rPr>
-        <w:t>晚餐：后沙海景或酒店圈**</w:t>
+        <w:t>晚餐: 后沙海景或酒店圈</w:t>
       </w:r>
     </w:p>
     <w:p>

</xml_diff>

<commit_message>
fix(yuhuan): D1 dinner label **晚餐：** format
</commit_message>
<xml_diff>
--- a/trip/yuhuan/yuhuan.docx
+++ b/trip/yuhuan/yuhuan.docx
@@ -127,7 +127,7 @@
     </w:p>
     <w:p>
       <w:pPr>
-        <w:spacing w:after="120" w:lineRule="auto" w:line="300"/>
+        <w:spacing w:after="60" w:lineRule="auto" w:line="300"/>
       </w:pPr>
       <w:r>
         <w:rPr>
@@ -135,7 +135,7 @@
           <w:b w:val="0"/>
           <w:sz w:val="21"/>
         </w:rPr>
-        <w:t>**晚餐：酒店周边**</w:t>
+        <w:t>晚餐: 酒店周边</w:t>
       </w:r>
     </w:p>
     <w:p>

</xml_diff>

<commit_message>
fix: render vacation meals as black day-spots like sightseeing
</commit_message>
<xml_diff>
--- a/trip/yuhuan/yuhuan.docx
+++ b/trip/yuhuan/yuhuan.docx
@@ -127,15 +127,15 @@
     </w:p>
     <w:p>
       <w:pPr>
-        <w:spacing w:after="60" w:lineRule="auto" w:line="300"/>
+        <w:spacing w:after="80" w:lineRule="auto" w:line="300"/>
       </w:pPr>
       <w:r>
         <w:rPr>
           <w:rFonts w:ascii="Helvetica Neue" w:hAnsi="Helvetica Neue" w:eastAsia="PingFang SC"/>
-          <w:b w:val="0"/>
+          <w:b/>
           <w:sz w:val="21"/>
         </w:rPr>
-        <w:t>晚餐: 酒店周边</w:t>
+        <w:t>晚餐：酒店周边</w:t>
       </w:r>
     </w:p>
     <w:p>
@@ -167,28 +167,28 @@
     </w:p>
     <w:p>
       <w:pPr>
-        <w:spacing w:after="60" w:lineRule="auto" w:line="300"/>
+        <w:spacing w:after="80" w:lineRule="auto" w:line="300"/>
       </w:pPr>
       <w:r>
         <w:rPr>
           <w:rFonts w:ascii="Helvetica Neue" w:hAnsi="Helvetica Neue" w:eastAsia="PingFang SC"/>
-          <w:b w:val="0"/>
+          <w:b/>
           <w:sz w:val="21"/>
         </w:rPr>
-        <w:t>午餐: 后沙·坎门一带</w:t>
+        <w:t>午餐：后沙·坎门一带</w:t>
       </w:r>
     </w:p>
     <w:p>
       <w:pPr>
-        <w:spacing w:after="60" w:lineRule="auto" w:line="300"/>
+        <w:spacing w:after="80" w:lineRule="auto" w:line="300"/>
       </w:pPr>
       <w:r>
         <w:rPr>
           <w:rFonts w:ascii="Helvetica Neue" w:hAnsi="Helvetica Neue" w:eastAsia="PingFang SC"/>
-          <w:b w:val="0"/>
+          <w:b/>
           <w:sz w:val="21"/>
         </w:rPr>
-        <w:t>晚餐: 后沙海景或酒店圈</w:t>
+        <w:t>晚餐：后沙海景或酒店圈</w:t>
       </w:r>
     </w:p>
     <w:p>
@@ -220,28 +220,28 @@
     </w:p>
     <w:p>
       <w:pPr>
-        <w:spacing w:after="60" w:lineRule="auto" w:line="300"/>
+        <w:spacing w:after="80" w:lineRule="auto" w:line="300"/>
       </w:pPr>
       <w:r>
         <w:rPr>
           <w:rFonts w:ascii="Helvetica Neue" w:hAnsi="Helvetica Neue" w:eastAsia="PingFang SC"/>
-          <w:b w:val="0"/>
+          <w:b/>
           <w:sz w:val="21"/>
         </w:rPr>
-        <w:t>午餐: 后沙·坎门一带</w:t>
+        <w:t>午餐：后沙·坎门一带</w:t>
       </w:r>
     </w:p>
     <w:p>
       <w:pPr>
-        <w:spacing w:after="60" w:lineRule="auto" w:line="300"/>
+        <w:spacing w:after="80" w:lineRule="auto" w:line="300"/>
       </w:pPr>
       <w:r>
         <w:rPr>
           <w:rFonts w:ascii="Helvetica Neue" w:hAnsi="Helvetica Neue" w:eastAsia="PingFang SC"/>
-          <w:b w:val="0"/>
+          <w:b/>
           <w:sz w:val="21"/>
         </w:rPr>
-        <w:t>晚餐: 后沙海景或酒店圈</w:t>
+        <w:t>晚餐：后沙海景或酒店圈</w:t>
       </w:r>
     </w:p>
     <w:p>

</xml_diff>

<commit_message>
fix(portal): sort by updated desc (drop manual order); unify arrival-day as D0 — yuhuan renumbered D1-D4→D0-D3, yunhe Day0→D0 (zh+en)
</commit_message>
<xml_diff>
--- a/trip/yuhuan/yuhuan.docx
+++ b/trip/yuhuan/yuhuan.docx
@@ -108,7 +108,7 @@
           <w:b/>
           <w:sz w:val="24"/>
         </w:rPr>
-        <w:t>D1（9月xx日）出发</w:t>
+        <w:t>D0（9月xx日）出发</w:t>
       </w:r>
     </w:p>
     <w:p>
@@ -162,7 +162,7 @@
           <w:b/>
           <w:sz w:val="24"/>
         </w:rPr>
-        <w:t>D2（9月xx日）</w:t>
+        <w:t>D1（9月xx日）</w:t>
       </w:r>
     </w:p>
     <w:p>
@@ -215,7 +215,7 @@
           <w:b/>
           <w:sz w:val="24"/>
         </w:rPr>
-        <w:t>D3（9月xx日）</w:t>
+        <w:t>D1（9月xx日）</w:t>
       </w:r>
     </w:p>
     <w:p>
@@ -268,7 +268,7 @@
           <w:b/>
           <w:sz w:val="24"/>
         </w:rPr>
-        <w:t>D4（9月xx日）返程</w:t>
+        <w:t>D1（9月xx日）返程</w:t>
       </w:r>
     </w:p>
     <w:p>

</xml_diff>